<commit_message>
docs(guides): cohorte M2-IBI-CYBER-2027 + depannage CRLF Windows dans le docx
Le guide Word eleve ne couvrait pas le correctif "patch does not apply"
(fins de ligne CRLF, issue #13) documente seulement dans le markdown,
ni l'exigence PowerShell 7. Ajout des deux + cas "clone d'une session
precedente : git pull". Cohorte d'exemple alignee sur la rentree.

Co-Authored-By: Claude Opus 5.5 <noreply@anthropic.com>
</commit_message>
<xml_diff>
--- a/docs/GUIDE-INSTALL-ELEVE.docx
+++ b/docs/GUIDE-INSTALL-ELEVE.docx
@@ -246,7 +246,7 @@
               <w:rPr>
                 <w:sz w:val="20"/>
               </w:rPr>
-              <w:t>JUICELAB-JUIN-2026</w:t>
+              <w:t>M2-IBI-CYBER-2027</w:t>
             </w:r>
           </w:p>
         </w:tc>
@@ -391,7 +391,7 @@
               <w:rPr>
                 <w:sz w:val="20"/>
               </w:rPr>
-              <w:t>Docker Desktop (avec WSL2) + Git for Windows (fournit Git et OpenSSL)</w:t>
+              <w:t>Docker Desktop (avec WSL2) + Git for Windows (fournit Git et OpenSSL) + PowerShell 7 (la version 5.1 livree avec Windows 10 ne suffit pas)</w:t>
             </w:r>
           </w:p>
         </w:tc>
@@ -531,7 +531,7 @@
           <w:rFonts w:ascii="Consolas" w:hAnsi="Consolas"/>
           <w:sz w:val="19"/>
         </w:rPr>
-        <w:t>.\scripts\install-student.ps1 -Dashboard 187.124.39.123 -Label amelie -Cohort JUICELAB-JUIN-2026</w:t>
+        <w:t>.\scripts\install-student.ps1 -Dashboard 187.124.39.123 -Label amelie -Cohort M2-IBI-CYBER-2027</w:t>
       </w:r>
     </w:p>
     <w:p>
@@ -625,7 +625,7 @@
           <w:rFonts w:ascii="Consolas" w:hAnsi="Consolas"/>
           <w:sz w:val="19"/>
         </w:rPr>
-        <w:t>./scripts/install-student.sh -d 187.124.39.123 -l amelie -c JUICELAB-JUIN-2026</w:t>
+        <w:t>./scripts/install-student.sh -d 187.124.39.123 -l amelie -c M2-IBI-CYBER-2027</w:t>
       </w:r>
     </w:p>
     <w:p>
@@ -1184,12 +1184,160 @@
               <w:rPr>
                 <w:sz w:val="20"/>
               </w:rPr>
-              <w:t>Verifie que tu as bien passe -d / -Dashboard avec la bonne IP et la meme cohorte (JUICELAB-JUIN-2026) que la classe.</w:t>
+              <w:t>Verifie que tu as bien passe -d / -Dashboard avec la bonne IP et la meme cohorte (M2-IBI-CYBER-2027) que la classe.</w:t>
+            </w:r>
+          </w:p>
+        </w:tc>
+      </w:tr>
+      <w:tr>
+        <w:tc>
+          <w:tcPr>
+            <w:tcW w:type="dxa" w:w="3118"/>
+          </w:tcPr>
+          <w:p>
+            <w:r/>
+            <w:r>
+              <w:rPr>
+                <w:sz w:val="20"/>
+              </w:rPr>
+              <w:t>Windows : le build echoue sur « patch does not apply » (config/default.yml, server.ts...)</w:t>
+            </w:r>
+          </w:p>
+        </w:tc>
+        <w:tc>
+          <w:tcPr>
+            <w:tcW w:type="dxa" w:w="6520"/>
+          </w:tcPr>
+          <w:p>
+            <w:r/>
+            <w:r>
+              <w:rPr>
+                <w:sz w:val="20"/>
+              </w:rPr>
+              <w:t>Fins de ligne converties en CRLF par Git for Windows. Supprime le dossier juicelab, desactive la conversion puis re-clone (commandes ci-dessous).</w:t>
+            </w:r>
+          </w:p>
+        </w:tc>
+      </w:tr>
+      <w:tr>
+        <w:tc>
+          <w:tcPr>
+            <w:tcW w:type="dxa" w:w="3118"/>
+          </w:tcPr>
+          <w:p>
+            <w:r/>
+            <w:r>
+              <w:rPr>
+                <w:sz w:val="20"/>
+              </w:rPr>
+              <w:t>J'avais deja clone le depot lors d'une session precedente</w:t>
+            </w:r>
+          </w:p>
+        </w:tc>
+        <w:tc>
+          <w:tcPr>
+            <w:tcW w:type="dxa" w:w="6520"/>
+          </w:tcPr>
+          <w:p>
+            <w:r/>
+            <w:r>
+              <w:rPr>
+                <w:sz w:val="20"/>
+              </w:rPr>
+              <w:t>Fais git pull (ou un clone neuf) avant de relancer l'installeur : il est idempotent et garde tes tokens.</w:t>
             </w:r>
           </w:p>
         </w:tc>
       </w:tr>
     </w:tbl>
+    <w:p>
+      <w:r>
+        <w:t>Correctif Windows « patch does not apply » (PowerShell) :</w:t>
+      </w:r>
+    </w:p>
+    <w:p>
+      <w:pPr>
+        <w:shd w:val="clear" w:fill="F2F2F2"/>
+        <w:spacing w:after="0" w:before="0"/>
+      </w:pPr>
+      <w:r>
+        <w:rPr>
+          <w:rFonts w:ascii="Consolas" w:hAnsi="Consolas"/>
+          <w:sz w:val="19"/>
+        </w:rPr>
+        <w:t>cd ..</w:t>
+      </w:r>
+    </w:p>
+    <w:p>
+      <w:pPr>
+        <w:shd w:val="clear" w:fill="F2F2F2"/>
+        <w:spacing w:after="0" w:before="0"/>
+      </w:pPr>
+      <w:r>
+        <w:rPr>
+          <w:rFonts w:ascii="Consolas" w:hAnsi="Consolas"/>
+          <w:sz w:val="19"/>
+        </w:rPr>
+        <w:t>Remove-Item -Recurse -Force juicelab</w:t>
+      </w:r>
+    </w:p>
+    <w:p>
+      <w:pPr>
+        <w:shd w:val="clear" w:fill="F2F2F2"/>
+        <w:spacing w:after="0" w:before="0"/>
+      </w:pPr>
+      <w:r>
+        <w:rPr>
+          <w:rFonts w:ascii="Consolas" w:hAnsi="Consolas"/>
+          <w:sz w:val="19"/>
+        </w:rPr>
+        <w:t>git config --global core.autocrlf false</w:t>
+      </w:r>
+    </w:p>
+    <w:p>
+      <w:pPr>
+        <w:shd w:val="clear" w:fill="F2F2F2"/>
+        <w:spacing w:after="0" w:before="0"/>
+      </w:pPr>
+      <w:r>
+        <w:rPr>
+          <w:rFonts w:ascii="Consolas" w:hAnsi="Consolas"/>
+          <w:sz w:val="19"/>
+        </w:rPr>
+        <w:t>git clone https://github.com/mo0ogly/juicelab.git</w:t>
+      </w:r>
+    </w:p>
+    <w:p>
+      <w:pPr>
+        <w:shd w:val="clear" w:fill="F2F2F2"/>
+        <w:spacing w:after="0" w:before="0"/>
+      </w:pPr>
+      <w:r>
+        <w:rPr>
+          <w:rFonts w:ascii="Consolas" w:hAnsi="Consolas"/>
+          <w:sz w:val="19"/>
+        </w:rPr>
+        <w:t>cd juicelab</w:t>
+      </w:r>
+    </w:p>
+    <w:p>
+      <w:pPr>
+        <w:shd w:val="clear" w:fill="F2F2F2"/>
+        <w:spacing w:after="0" w:before="0"/>
+      </w:pPr>
+      <w:r>
+        <w:rPr>
+          <w:rFonts w:ascii="Consolas" w:hAnsi="Consolas"/>
+          <w:sz w:val="19"/>
+        </w:rPr>
+        <w:t>.\scripts\install-student.ps1 -Dashboard 187.124.39.123 -Label amelie -Cohort M2-IBI-CYBER-2027</w:t>
+      </w:r>
+    </w:p>
+    <w:p>
+      <w:pPr>
+        <w:spacing w:after="80"/>
+      </w:pPr>
+    </w:p>
     <w:p>
       <w:pPr>
         <w:pStyle w:val="Heading1"/>

</xml_diff>